<commit_message>
docs: finalize Project UIL documentation framework
Completed a major documentation milestone for Project UIL.

Today's work focused on strengthening the project's governance and documentation framework by organizing and refining the official documentation structure.

Completed work includes:

• Refined the root documentation (README.md)
• Finalized the documentation hierarchy
• Added the official Project UIL Roadmap
• Improved governance and document relationships
• Standardized document purposes and organization
• Strengthened long-term project structure
• Reviewed documentation consistency across the framework

The documentation now provides a clearer foundation for branding, publishing, research methodology, communication, governance, and long-term strategic planning.

Research. Understand. Build.

Co-Authored-By: jothish-blip <215570346+jothish-blip@users.noreply.github.com>
</commit_message>
<xml_diff>
--- a/atlas/Patterns/ PAT-001 - Context Loss Over Time.docx
+++ b/atlas/Patterns/ PAT-001 - Context Loss Over Time.docx
@@ -29,22 +29,25 @@
           <w:b/>
           <w:bCs/>
         </w:rPr>
-        <w:t>Title</w:t>
-      </w:r>
-    </w:p>
-    <w:p>
-      <w:r>
-        <w:rPr>
-          <w:b/>
-          <w:bCs/>
-        </w:rPr>
-        <w:t>Context Loss Over Time</w:t>
-      </w:r>
-    </w:p>
-    <w:p>
-      <w:r>
-        <w:pict w14:anchorId="16A2D173">
-          <v:rect id="_x0000_i1085" style="width:0;height:1.5pt" o:hralign="center" o:hrstd="t" o:hr="t" fillcolor="#a0a0a0" stroked="f"/>
+        <w:t>Pattern Identifier</w:t>
+      </w:r>
+    </w:p>
+    <w:p>
+      <w:r>
+        <w:rPr>
+          <w:b/>
+          <w:bCs/>
+        </w:rPr>
+        <w:t>PTID:</w:t>
+      </w:r>
+      <w:r>
+        <w:t xml:space="preserve"> PAT-001</w:t>
+      </w:r>
+    </w:p>
+    <w:p>
+      <w:r>
+        <w:pict w14:anchorId="74B784F8">
+          <v:rect id="_x0000_i1129" style="width:0;height:1.5pt" o:hralign="center" o:hrstd="t" o:hr="t" fillcolor="#a0a0a0" stroked="f"/>
         </w:pict>
       </w:r>
     </w:p>
@@ -60,7 +63,624 @@
           <w:b/>
           <w:bCs/>
         </w:rPr>
-        <w:t>Pattern Metadata</w:t>
+        <w:t>Pattern Title</w:t>
+      </w:r>
+    </w:p>
+    <w:p>
+      <w:r>
+        <w:rPr>
+          <w:b/>
+          <w:bCs/>
+        </w:rPr>
+        <w:t>Title:</w:t>
+      </w:r>
+      <w:r>
+        <w:t xml:space="preserve"> Context Loss Over Time</w:t>
+      </w:r>
+    </w:p>
+    <w:p>
+      <w:r>
+        <w:pict w14:anchorId="3F7505CB">
+          <v:rect id="_x0000_i1130" style="width:0;height:1.5pt" o:hralign="center" o:hrstd="t" o:hr="t" fillcolor="#a0a0a0" stroked="f"/>
+        </w:pict>
+      </w:r>
+    </w:p>
+    <w:p>
+      <w:pPr>
+        <w:rPr>
+          <w:b/>
+          <w:bCs/>
+        </w:rPr>
+      </w:pPr>
+      <w:r>
+        <w:rPr>
+          <w:b/>
+          <w:bCs/>
+        </w:rPr>
+        <w:t>Primary Research Category</w:t>
+      </w:r>
+    </w:p>
+    <w:p>
+      <w:r>
+        <w:rPr>
+          <w:b/>
+          <w:bCs/>
+        </w:rPr>
+        <w:t>Category:</w:t>
+      </w:r>
+      <w:r>
+        <w:t xml:space="preserve"> Cognitive &amp; Information Management</w:t>
+      </w:r>
+    </w:p>
+    <w:p>
+      <w:r>
+        <w:pict w14:anchorId="076C2593">
+          <v:rect id="_x0000_i1131" style="width:0;height:1.5pt" o:hralign="center" o:hrstd="t" o:hr="t" fillcolor="#a0a0a0" stroked="f"/>
+        </w:pict>
+      </w:r>
+    </w:p>
+    <w:p>
+      <w:pPr>
+        <w:rPr>
+          <w:b/>
+          <w:bCs/>
+        </w:rPr>
+      </w:pPr>
+      <w:r>
+        <w:rPr>
+          <w:b/>
+          <w:bCs/>
+        </w:rPr>
+        <w:t>Current Research Status</w:t>
+      </w:r>
+    </w:p>
+    <w:p>
+      <w:r>
+        <w:rPr>
+          <w:b/>
+          <w:bCs/>
+        </w:rPr>
+        <w:t>Status:</w:t>
+      </w:r>
+      <w:r>
+        <w:t xml:space="preserve"> Candidate </w:t>
+      </w:r>
+      <w:r>
+        <w:rPr>
+          <w:i/>
+          <w:iCs/>
+        </w:rPr>
+        <w:t>(Upgrade to Accepted after further validation.)</w:t>
+      </w:r>
+    </w:p>
+    <w:p>
+      <w:r>
+        <w:pict w14:anchorId="5AEA304C">
+          <v:rect id="_x0000_i1132" style="width:0;height:1.5pt" o:hralign="center" o:hrstd="t" o:hr="t" fillcolor="#a0a0a0" stroked="f"/>
+        </w:pict>
+      </w:r>
+    </w:p>
+    <w:p>
+      <w:pPr>
+        <w:rPr>
+          <w:b/>
+          <w:bCs/>
+        </w:rPr>
+      </w:pPr>
+      <w:r>
+        <w:rPr>
+          <w:b/>
+          <w:bCs/>
+        </w:rPr>
+        <w:t>Validation Confidence</w:t>
+      </w:r>
+    </w:p>
+    <w:p>
+      <w:r>
+        <w:rPr>
+          <w:b/>
+          <w:bCs/>
+        </w:rPr>
+        <w:t>Confidence Level:</w:t>
+      </w:r>
+      <w:r>
+        <w:t xml:space="preserve"> Level 4 – Strong Evidence</w:t>
+      </w:r>
+    </w:p>
+    <w:p>
+      <w:r>
+        <w:pict w14:anchorId="654BC0C7">
+          <v:rect id="_x0000_i1133" style="width:0;height:1.5pt" o:hralign="center" o:hrstd="t" o:hr="t" fillcolor="#a0a0a0" stroked="f"/>
+        </w:pict>
+      </w:r>
+    </w:p>
+    <w:p>
+      <w:pPr>
+        <w:rPr>
+          <w:b/>
+          <w:bCs/>
+        </w:rPr>
+      </w:pPr>
+      <w:r>
+        <w:rPr>
+          <w:b/>
+          <w:bCs/>
+        </w:rPr>
+        <w:t>Document Version</w:t>
+      </w:r>
+    </w:p>
+    <w:p>
+      <w:r>
+        <w:rPr>
+          <w:b/>
+          <w:bCs/>
+        </w:rPr>
+        <w:t>Version:</w:t>
+      </w:r>
+      <w:r>
+        <w:t xml:space="preserve"> 1.0</w:t>
+      </w:r>
+    </w:p>
+    <w:p>
+      <w:r>
+        <w:pict w14:anchorId="262F8516">
+          <v:rect id="_x0000_i1134" style="width:0;height:1.5pt" o:hralign="center" o:hrstd="t" o:hr="t" fillcolor="#a0a0a0" stroked="f"/>
+        </w:pict>
+      </w:r>
+    </w:p>
+    <w:p>
+      <w:pPr>
+        <w:rPr>
+          <w:b/>
+          <w:bCs/>
+        </w:rPr>
+      </w:pPr>
+      <w:r>
+        <w:rPr>
+          <w:b/>
+          <w:bCs/>
+        </w:rPr>
+        <w:t>Creation Date</w:t>
+      </w:r>
+    </w:p>
+    <w:p>
+      <w:r>
+        <w:rPr>
+          <w:b/>
+          <w:bCs/>
+        </w:rPr>
+        <w:t>Created:</w:t>
+      </w:r>
+      <w:r>
+        <w:t xml:space="preserve"> 2026-07-26</w:t>
+      </w:r>
+    </w:p>
+    <w:p>
+      <w:r>
+        <w:pict w14:anchorId="08115AF6">
+          <v:rect id="_x0000_i1135" style="width:0;height:1.5pt" o:hralign="center" o:hrstd="t" o:hr="t" fillcolor="#a0a0a0" stroked="f"/>
+        </w:pict>
+      </w:r>
+    </w:p>
+    <w:p>
+      <w:pPr>
+        <w:rPr>
+          <w:b/>
+          <w:bCs/>
+        </w:rPr>
+      </w:pPr>
+      <w:r>
+        <w:rPr>
+          <w:b/>
+          <w:bCs/>
+        </w:rPr>
+        <w:t>Last Modification Date</w:t>
+      </w:r>
+    </w:p>
+    <w:p>
+      <w:r>
+        <w:rPr>
+          <w:b/>
+          <w:bCs/>
+        </w:rPr>
+        <w:t>Last Updated:</w:t>
+      </w:r>
+      <w:r>
+        <w:t xml:space="preserve"> 2026-07-26</w:t>
+      </w:r>
+    </w:p>
+    <w:p>
+      <w:r>
+        <w:pict w14:anchorId="1CDB4B2A">
+          <v:rect id="_x0000_i1136" style="width:0;height:1.5pt" o:hralign="center" o:hrstd="t" o:hr="t" fillcolor="#a0a0a0" stroked="f"/>
+        </w:pict>
+      </w:r>
+    </w:p>
+    <w:p>
+      <w:pPr>
+        <w:rPr>
+          <w:b/>
+          <w:bCs/>
+        </w:rPr>
+      </w:pPr>
+      <w:r>
+        <w:rPr>
+          <w:b/>
+          <w:bCs/>
+        </w:rPr>
+        <w:t>Standardized Search Keywords</w:t>
+      </w:r>
+    </w:p>
+    <w:p>
+      <w:r>
+        <w:rPr>
+          <w:b/>
+          <w:bCs/>
+        </w:rPr>
+        <w:t>Tags:</w:t>
+      </w:r>
+      <w:r>
+        <w:t xml:space="preserve"> Memory, Context, Information Management, Cognitive Load, Navigation</w:t>
+      </w:r>
+    </w:p>
+    <w:p>
+      <w:r>
+        <w:pict w14:anchorId="23DF3BCA">
+          <v:rect id="_x0000_i1137" style="width:0;height:1.5pt" o:hralign="center" o:hrstd="t" o:hr="t" fillcolor="#a0a0a0" stroked="f"/>
+        </w:pict>
+      </w:r>
+    </w:p>
+    <w:p>
+      <w:pPr>
+        <w:rPr>
+          <w:b/>
+          <w:bCs/>
+        </w:rPr>
+      </w:pPr>
+      <w:r>
+        <w:rPr>
+          <w:b/>
+          <w:bCs/>
+        </w:rPr>
+        <w:lastRenderedPageBreak/>
+        <w:t>Supporting Atlas Problem Identifiers</w:t>
+      </w:r>
+    </w:p>
+    <w:p>
+      <w:r>
+        <w:rPr>
+          <w:b/>
+          <w:bCs/>
+        </w:rPr>
+        <w:t>Supporting APIDs:</w:t>
+      </w:r>
+    </w:p>
+    <w:p>
+      <w:pPr>
+        <w:numPr>
+          <w:ilvl w:val="0"/>
+          <w:numId w:val="6"/>
+        </w:numPr>
+      </w:pPr>
+      <w:r>
+        <w:t xml:space="preserve">FF-001 </w:t>
+      </w:r>
+    </w:p>
+    <w:p>
+      <w:pPr>
+        <w:numPr>
+          <w:ilvl w:val="0"/>
+          <w:numId w:val="6"/>
+        </w:numPr>
+      </w:pPr>
+      <w:r>
+        <w:t xml:space="preserve">FF-002 </w:t>
+      </w:r>
+    </w:p>
+    <w:p>
+      <w:pPr>
+        <w:numPr>
+          <w:ilvl w:val="0"/>
+          <w:numId w:val="6"/>
+        </w:numPr>
+      </w:pPr>
+      <w:r>
+        <w:t xml:space="preserve">FF-003 </w:t>
+      </w:r>
+    </w:p>
+    <w:p>
+      <w:pPr>
+        <w:numPr>
+          <w:ilvl w:val="0"/>
+          <w:numId w:val="6"/>
+        </w:numPr>
+      </w:pPr>
+      <w:r>
+        <w:t xml:space="preserve">FF-004 </w:t>
+      </w:r>
+    </w:p>
+    <w:p>
+      <w:r>
+        <w:pict w14:anchorId="46056A55">
+          <v:rect id="_x0000_i1138" style="width:0;height:1.5pt" o:hralign="center" o:hrstd="t" o:hr="t" fillcolor="#a0a0a0" stroked="f"/>
+        </w:pict>
+      </w:r>
+    </w:p>
+    <w:p>
+      <w:pPr>
+        <w:rPr>
+          <w:b/>
+          <w:bCs/>
+        </w:rPr>
+      </w:pPr>
+      <w:r>
+        <w:rPr>
+          <w:b/>
+          <w:bCs/>
+        </w:rPr>
+        <w:t>Pattern</w:t>
+      </w:r>
+    </w:p>
+    <w:p>
+      <w:r>
+        <w:t>As digital information grows and ages, people gradually lose the contextual understanding needed to locate, interpret, and effectively use that information. Although the information remains available, the surrounding knowledge—such as why it was created, where it was stored, how it was organized, and how it relates to other information—fades over time.</w:t>
+      </w:r>
+    </w:p>
+    <w:p>
+      <w:r>
+        <w:t>This recurring pattern reflects a fundamental limitation of human memory interacting with increasingly complex digital environments. It appears consistently across multiple Human Frictions involving file management, project organization, navigation, and information retrieval.</w:t>
+      </w:r>
+    </w:p>
+    <w:p>
+      <w:r>
+        <w:pict w14:anchorId="58CD1053">
+          <v:rect id="_x0000_i1139" style="width:0;height:1.5pt" o:hralign="center" o:hrstd="t" o:hr="t" fillcolor="#a0a0a0" stroked="f"/>
+        </w:pict>
+      </w:r>
+    </w:p>
+    <w:p>
+      <w:pPr>
+        <w:rPr>
+          <w:b/>
+          <w:bCs/>
+        </w:rPr>
+      </w:pPr>
+      <w:r>
+        <w:rPr>
+          <w:b/>
+          <w:bCs/>
+        </w:rPr>
+        <w:t>Human Impact</w:t>
+      </w:r>
+    </w:p>
+    <w:p>
+      <w:r>
+        <w:t>This pattern contributes to:</w:t>
+      </w:r>
+    </w:p>
+    <w:p>
+      <w:pPr>
+        <w:numPr>
+          <w:ilvl w:val="0"/>
+          <w:numId w:val="7"/>
+        </w:numPr>
+      </w:pPr>
+      <w:r>
+        <w:t xml:space="preserve">Increased cognitive load while recalling information. </w:t>
+      </w:r>
+    </w:p>
+    <w:p>
+      <w:pPr>
+        <w:numPr>
+          <w:ilvl w:val="0"/>
+          <w:numId w:val="7"/>
+        </w:numPr>
+      </w:pPr>
+      <w:r>
+        <w:t xml:space="preserve">Longer search times for existing content. </w:t>
+      </w:r>
+    </w:p>
+    <w:p>
+      <w:pPr>
+        <w:numPr>
+          <w:ilvl w:val="0"/>
+          <w:numId w:val="7"/>
+        </w:numPr>
+      </w:pPr>
+      <w:r>
+        <w:t xml:space="preserve">Confusion caused by missing or forgotten context. </w:t>
+      </w:r>
+    </w:p>
+    <w:p>
+      <w:pPr>
+        <w:numPr>
+          <w:ilvl w:val="0"/>
+          <w:numId w:val="7"/>
+        </w:numPr>
+      </w:pPr>
+      <w:r>
+        <w:t xml:space="preserve">Duplicate work because existing information cannot be located or understood. </w:t>
+      </w:r>
+    </w:p>
+    <w:p>
+      <w:pPr>
+        <w:numPr>
+          <w:ilvl w:val="0"/>
+          <w:numId w:val="7"/>
+        </w:numPr>
+      </w:pPr>
+      <w:r>
+        <w:t xml:space="preserve">Reduced productivity during information-intensive tasks. </w:t>
+      </w:r>
+    </w:p>
+    <w:p>
+      <w:pPr>
+        <w:numPr>
+          <w:ilvl w:val="0"/>
+          <w:numId w:val="7"/>
+        </w:numPr>
+      </w:pPr>
+      <w:r>
+        <w:t xml:space="preserve">Interrupted workflows as users attempt to reconstruct lost context. </w:t>
+      </w:r>
+    </w:p>
+    <w:p>
+      <w:r>
+        <w:pict w14:anchorId="4DF82B00">
+          <v:rect id="_x0000_i1140" style="width:0;height:1.5pt" o:hralign="center" o:hrstd="t" o:hr="t" fillcolor="#a0a0a0" stroked="f"/>
+        </w:pict>
+      </w:r>
+    </w:p>
+    <w:p>
+      <w:pPr>
+        <w:rPr>
+          <w:b/>
+          <w:bCs/>
+        </w:rPr>
+      </w:pPr>
+      <w:r>
+        <w:rPr>
+          <w:b/>
+          <w:bCs/>
+        </w:rPr>
+        <w:t>Evidence</w:t>
+      </w:r>
+    </w:p>
+    <w:p>
+      <w:r>
+        <w:t>This Pattern is currently supported by the following Human Frictions:</w:t>
+      </w:r>
+    </w:p>
+    <w:p>
+      <w:pPr>
+        <w:numPr>
+          <w:ilvl w:val="0"/>
+          <w:numId w:val="8"/>
+        </w:numPr>
+      </w:pPr>
+      <w:r>
+        <w:rPr>
+          <w:b/>
+          <w:bCs/>
+        </w:rPr>
+        <w:t>FF-001</w:t>
+      </w:r>
+      <w:r>
+        <w:t xml:space="preserve"> – Users struggle to locate downloaded files after downloading them. </w:t>
+      </w:r>
+    </w:p>
+    <w:p>
+      <w:pPr>
+        <w:numPr>
+          <w:ilvl w:val="0"/>
+          <w:numId w:val="8"/>
+        </w:numPr>
+      </w:pPr>
+      <w:r>
+        <w:rPr>
+          <w:b/>
+          <w:bCs/>
+        </w:rPr>
+        <w:lastRenderedPageBreak/>
+        <w:t>FF-002</w:t>
+      </w:r>
+      <w:r>
+        <w:t xml:space="preserve"> – Large collections of files and folders become difficult to understand and navigate. </w:t>
+      </w:r>
+    </w:p>
+    <w:p>
+      <w:pPr>
+        <w:numPr>
+          <w:ilvl w:val="0"/>
+          <w:numId w:val="8"/>
+        </w:numPr>
+      </w:pPr>
+      <w:r>
+        <w:rPr>
+          <w:b/>
+          <w:bCs/>
+        </w:rPr>
+        <w:t>FF-003</w:t>
+      </w:r>
+      <w:r>
+        <w:t xml:space="preserve"> – Users forget or no longer understand file and folder names over time. </w:t>
+      </w:r>
+    </w:p>
+    <w:p>
+      <w:pPr>
+        <w:numPr>
+          <w:ilvl w:val="0"/>
+          <w:numId w:val="8"/>
+        </w:numPr>
+      </w:pPr>
+      <w:r>
+        <w:rPr>
+          <w:b/>
+          <w:bCs/>
+        </w:rPr>
+        <w:t>FF-004</w:t>
+      </w:r>
+      <w:r>
+        <w:t xml:space="preserve"> – Navigating large software projects becomes increasingly difficult as contextual understanding declines. </w:t>
+      </w:r>
+    </w:p>
+    <w:p>
+      <w:r>
+        <w:t>Across these observations, the recurring relationship is the gradual loss of contextual knowledge rather than the loss of the information itself. Each Human Friction demonstrates how preserved data becomes less useful when its surrounding context fades.</w:t>
+      </w:r>
+    </w:p>
+    <w:p>
+      <w:r>
+        <w:pict w14:anchorId="44967997">
+          <v:rect id="_x0000_i1141" style="width:0;height:1.5pt" o:hralign="center" o:hrstd="t" o:hr="t" fillcolor="#a0a0a0" stroked="f"/>
+        </w:pict>
+      </w:r>
+    </w:p>
+    <w:p>
+      <w:pPr>
+        <w:rPr>
+          <w:b/>
+          <w:bCs/>
+        </w:rPr>
+      </w:pPr>
+      <w:r>
+        <w:rPr>
+          <w:b/>
+          <w:bCs/>
+        </w:rPr>
+        <w:t>Research Notes</w:t>
+      </w:r>
+    </w:p>
+    <w:p>
+      <w:r>
+        <w:t>Current evidence suggests that Context Loss Over Time is a foundational behavioural pattern affecting digital information management. As additional Human Frictions are documented across other ATLAS categories, this Pattern should continue to be evaluated for broader applicability.</w:t>
+      </w:r>
+    </w:p>
+    <w:p>
+      <w:r>
+        <w:t>Future validation should determine whether this Pattern extends beyond file management into areas such as communication, learning, authentication, collaboration, and knowledge work.</w:t>
+      </w:r>
+    </w:p>
+    <w:p>
+      <w:r>
+        <w:pict w14:anchorId="5BC3607C">
+          <v:rect id="_x0000_i1142" style="width:0;height:1.5pt" o:hralign="center" o:hrstd="t" o:hr="t" fillcolor="#a0a0a0" stroked="f"/>
+        </w:pict>
+      </w:r>
+    </w:p>
+    <w:p>
+      <w:pPr>
+        <w:rPr>
+          <w:b/>
+          <w:bCs/>
+        </w:rPr>
+      </w:pPr>
+      <w:r>
+        <w:rPr>
+          <w:b/>
+          <w:bCs/>
+        </w:rPr>
+        <w:t>Revision History</w:t>
       </w:r>
     </w:p>
     <w:tbl>
@@ -76,8 +696,9 @@
         <w:tblLook w:val="04A0" w:firstRow="1" w:lastRow="0" w:firstColumn="1" w:lastColumn="0" w:noHBand="0" w:noVBand="1"/>
       </w:tblPr>
       <w:tblGrid>
-        <w:gridCol w:w="3304"/>
-        <w:gridCol w:w="5722"/>
+        <w:gridCol w:w="897"/>
+        <w:gridCol w:w="1249"/>
+        <w:gridCol w:w="5246"/>
       </w:tblGrid>
       <w:tr>
         <w:trPr>
@@ -102,7 +723,7 @@
                 <w:b/>
                 <w:bCs/>
               </w:rPr>
-              <w:t>Field</w:t>
+              <w:t>Version</w:t>
             </w:r>
           </w:p>
         </w:tc>
@@ -124,7 +745,29 @@
                 <w:b/>
                 <w:bCs/>
               </w:rPr>
-              <w:t>Value</w:t>
+              <w:t>Date</w:t>
+            </w:r>
+          </w:p>
+        </w:tc>
+        <w:tc>
+          <w:tcPr>
+            <w:tcW w:w="0" w:type="auto"/>
+            <w:vAlign w:val="center"/>
+            <w:hideMark/>
+          </w:tcPr>
+          <w:p>
+            <w:pPr>
+              <w:rPr>
+                <w:b/>
+                <w:bCs/>
+              </w:rPr>
+            </w:pPr>
+            <w:r>
+              <w:rPr>
+                <w:b/>
+                <w:bCs/>
+              </w:rPr>
+              <w:t>Description</w:t>
             </w:r>
           </w:p>
         </w:tc>
@@ -141,11 +784,7 @@
           </w:tcPr>
           <w:p>
             <w:r>
-              <w:rPr>
-                <w:b/>
-                <w:bCs/>
-              </w:rPr>
-              <w:t>Atlas Pattern Identifier (PATID)</w:t>
+              <w:t>1.0</w:t>
             </w:r>
           </w:p>
         </w:tc>
@@ -157,28 +796,7 @@
           </w:tcPr>
           <w:p>
             <w:r>
-              <w:t>PAT-001</w:t>
-            </w:r>
-          </w:p>
-        </w:tc>
-      </w:tr>
-      <w:tr>
-        <w:trPr>
-          <w:tblCellSpacing w:w="15" w:type="dxa"/>
-        </w:trPr>
-        <w:tc>
-          <w:tcPr>
-            <w:tcW w:w="0" w:type="auto"/>
-            <w:vAlign w:val="center"/>
-            <w:hideMark/>
-          </w:tcPr>
-          <w:p>
-            <w:r>
-              <w:rPr>
-                <w:b/>
-                <w:bCs/>
-              </w:rPr>
-              <w:t>Title</w:t>
+              <w:t>2026-07-26</w:t>
             </w:r>
           </w:p>
         </w:tc>
@@ -190,731 +808,12 @@
           </w:tcPr>
           <w:p>
             <w:r>
-              <w:t>Context Loss Over Time</w:t>
-            </w:r>
-          </w:p>
-        </w:tc>
-      </w:tr>
-      <w:tr>
-        <w:trPr>
-          <w:tblCellSpacing w:w="15" w:type="dxa"/>
-        </w:trPr>
-        <w:tc>
-          <w:tcPr>
-            <w:tcW w:w="0" w:type="auto"/>
-            <w:vAlign w:val="center"/>
-            <w:hideMark/>
-          </w:tcPr>
-          <w:p>
-            <w:r>
-              <w:rPr>
-                <w:b/>
-                <w:bCs/>
-              </w:rPr>
-              <w:t>Category</w:t>
-            </w:r>
-          </w:p>
-        </w:tc>
-        <w:tc>
-          <w:tcPr>
-            <w:tcW w:w="0" w:type="auto"/>
-            <w:vAlign w:val="center"/>
-            <w:hideMark/>
-          </w:tcPr>
-          <w:p>
-            <w:r>
-              <w:t>Cognitive &amp; Information Management</w:t>
-            </w:r>
-          </w:p>
-        </w:tc>
-      </w:tr>
-      <w:tr>
-        <w:trPr>
-          <w:tblCellSpacing w:w="15" w:type="dxa"/>
-        </w:trPr>
-        <w:tc>
-          <w:tcPr>
-            <w:tcW w:w="0" w:type="auto"/>
-            <w:vAlign w:val="center"/>
-            <w:hideMark/>
-          </w:tcPr>
-          <w:p>
-            <w:r>
-              <w:rPr>
-                <w:b/>
-                <w:bCs/>
-              </w:rPr>
-              <w:t>Status</w:t>
-            </w:r>
-          </w:p>
-        </w:tc>
-        <w:tc>
-          <w:tcPr>
-            <w:tcW w:w="0" w:type="auto"/>
-            <w:vAlign w:val="center"/>
-            <w:hideMark/>
-          </w:tcPr>
-          <w:p>
-            <w:r>
-              <w:t>Candidate (upgrade to Accepted after further validation)</w:t>
-            </w:r>
-          </w:p>
-        </w:tc>
-      </w:tr>
-      <w:tr>
-        <w:trPr>
-          <w:tblCellSpacing w:w="15" w:type="dxa"/>
-        </w:trPr>
-        <w:tc>
-          <w:tcPr>
-            <w:tcW w:w="0" w:type="auto"/>
-            <w:vAlign w:val="center"/>
-            <w:hideMark/>
-          </w:tcPr>
-          <w:p>
-            <w:r>
-              <w:rPr>
-                <w:b/>
-                <w:bCs/>
-              </w:rPr>
-              <w:t>Confidence</w:t>
-            </w:r>
-          </w:p>
-        </w:tc>
-        <w:tc>
-          <w:tcPr>
-            <w:tcW w:w="0" w:type="auto"/>
-            <w:vAlign w:val="center"/>
-            <w:hideMark/>
-          </w:tcPr>
-          <w:p>
-            <w:r>
-              <w:t>High</w:t>
-            </w:r>
-          </w:p>
-        </w:tc>
-      </w:tr>
-      <w:tr>
-        <w:trPr>
-          <w:tblCellSpacing w:w="15" w:type="dxa"/>
-        </w:trPr>
-        <w:tc>
-          <w:tcPr>
-            <w:tcW w:w="0" w:type="auto"/>
-            <w:vAlign w:val="center"/>
-            <w:hideMark/>
-          </w:tcPr>
-          <w:p>
-            <w:r>
-              <w:rPr>
-                <w:b/>
-                <w:bCs/>
-              </w:rPr>
-              <w:t>Version</w:t>
-            </w:r>
-          </w:p>
-        </w:tc>
-        <w:tc>
-          <w:tcPr>
-            <w:tcW w:w="0" w:type="auto"/>
-            <w:vAlign w:val="center"/>
-            <w:hideMark/>
-          </w:tcPr>
-          <w:p>
-            <w:r>
-              <w:t>1.0</w:t>
-            </w:r>
-          </w:p>
-        </w:tc>
-      </w:tr>
-      <w:tr>
-        <w:trPr>
-          <w:tblCellSpacing w:w="15" w:type="dxa"/>
-        </w:trPr>
-        <w:tc>
-          <w:tcPr>
-            <w:tcW w:w="0" w:type="auto"/>
-            <w:vAlign w:val="center"/>
-            <w:hideMark/>
-          </w:tcPr>
-          <w:p>
-            <w:r>
-              <w:rPr>
-                <w:b/>
-                <w:bCs/>
-              </w:rPr>
-              <w:t>Author</w:t>
-            </w:r>
-          </w:p>
-        </w:tc>
-        <w:tc>
-          <w:tcPr>
-            <w:tcW w:w="0" w:type="auto"/>
-            <w:vAlign w:val="center"/>
-            <w:hideMark/>
-          </w:tcPr>
-          <w:p>
-            <w:r>
-              <w:t>Project UIL Research</w:t>
-            </w:r>
-          </w:p>
-        </w:tc>
-      </w:tr>
-      <w:tr>
-        <w:trPr>
-          <w:tblCellSpacing w:w="15" w:type="dxa"/>
-        </w:trPr>
-        <w:tc>
-          <w:tcPr>
-            <w:tcW w:w="0" w:type="auto"/>
-            <w:vAlign w:val="center"/>
-            <w:hideMark/>
-          </w:tcPr>
-          <w:p>
-            <w:r>
-              <w:rPr>
-                <w:b/>
-                <w:bCs/>
-              </w:rPr>
-              <w:t>Last Updated</w:t>
-            </w:r>
-          </w:p>
-        </w:tc>
-        <w:tc>
-          <w:tcPr>
-            <w:tcW w:w="0" w:type="auto"/>
-            <w:vAlign w:val="center"/>
-            <w:hideMark/>
-          </w:tcPr>
-          <w:p>
-            <w:r>
-              <w:t>26 July 2026</w:t>
+              <w:t>Initial documentation using Pattern Template v2.0.</w:t>
             </w:r>
           </w:p>
         </w:tc>
       </w:tr>
     </w:tbl>
-    <w:p>
-      <w:r>
-        <w:pict w14:anchorId="7F49F93F">
-          <v:rect id="_x0000_i1086" style="width:0;height:1.5pt" o:hralign="center" o:hrstd="t" o:hr="t" fillcolor="#a0a0a0" stroked="f"/>
-        </w:pict>
-      </w:r>
-    </w:p>
-    <w:p>
-      <w:pPr>
-        <w:rPr>
-          <w:b/>
-          <w:bCs/>
-        </w:rPr>
-      </w:pPr>
-      <w:r>
-        <w:rPr>
-          <w:b/>
-          <w:bCs/>
-        </w:rPr>
-        <w:t>Pattern Statement</w:t>
-      </w:r>
-    </w:p>
-    <w:p>
-      <w:r>
-        <w:t>As digital information ages or grows in complexity, users gradually lose the contextual understanding needed to locate, interpret, and use that information effectively. The information still exists, but the knowledge surrounding it fades.</w:t>
-      </w:r>
-    </w:p>
-    <w:p>
-      <w:r>
-        <w:pict w14:anchorId="53EBE93C">
-          <v:rect id="_x0000_i1087" style="width:0;height:1.5pt" o:hralign="center" o:hrstd="t" o:hr="t" fillcolor="#a0a0a0" stroked="f"/>
-        </w:pict>
-      </w:r>
-    </w:p>
-    <w:p>
-      <w:pPr>
-        <w:rPr>
-          <w:b/>
-          <w:bCs/>
-        </w:rPr>
-      </w:pPr>
-      <w:r>
-        <w:rPr>
-          <w:b/>
-          <w:bCs/>
-        </w:rPr>
-        <w:t>Description</w:t>
-      </w:r>
-    </w:p>
-    <w:p>
-      <w:r>
-        <w:t>This pattern represents a recurring human limitation rather than a software defect. People naturally forget why information was created, where it was stored, how it was organized, and how different pieces of information relate to one another.</w:t>
-      </w:r>
-    </w:p>
-    <w:p>
-      <w:r>
-        <w:t>The result is increased search effort, confusion, duplicate work, and reduced productivity.</w:t>
-      </w:r>
-    </w:p>
-    <w:p>
-      <w:r>
-        <w:pict w14:anchorId="1C5F8CAC">
-          <v:rect id="_x0000_i1088" style="width:0;height:1.5pt" o:hralign="center" o:hrstd="t" o:hr="t" fillcolor="#a0a0a0" stroked="f"/>
-        </w:pict>
-      </w:r>
-    </w:p>
-    <w:p>
-      <w:pPr>
-        <w:rPr>
-          <w:b/>
-          <w:bCs/>
-        </w:rPr>
-      </w:pPr>
-      <w:r>
-        <w:rPr>
-          <w:b/>
-          <w:bCs/>
-        </w:rPr>
-        <w:lastRenderedPageBreak/>
-        <w:t>Evidence</w:t>
-      </w:r>
-    </w:p>
-    <w:p>
-      <w:r>
-        <w:t>Currently observed in:</w:t>
-      </w:r>
-    </w:p>
-    <w:p>
-      <w:pPr>
-        <w:numPr>
-          <w:ilvl w:val="0"/>
-          <w:numId w:val="1"/>
-        </w:numPr>
-      </w:pPr>
-      <w:r>
-        <w:t xml:space="preserve">FF-001 — Downloaded files are difficult to find after downloading. </w:t>
-      </w:r>
-    </w:p>
-    <w:p>
-      <w:pPr>
-        <w:numPr>
-          <w:ilvl w:val="0"/>
-          <w:numId w:val="1"/>
-        </w:numPr>
-      </w:pPr>
-      <w:r>
-        <w:t xml:space="preserve">FF-002 — Too many files and folders make projects difficult to understand. </w:t>
-      </w:r>
-    </w:p>
-    <w:p>
-      <w:pPr>
-        <w:numPr>
-          <w:ilvl w:val="0"/>
-          <w:numId w:val="1"/>
-        </w:numPr>
-      </w:pPr>
-      <w:r>
-        <w:t xml:space="preserve">FF-003 — Users suddenly forget or don't understand file and folder names. </w:t>
-      </w:r>
-    </w:p>
-    <w:p>
-      <w:pPr>
-        <w:numPr>
-          <w:ilvl w:val="0"/>
-          <w:numId w:val="1"/>
-        </w:numPr>
-      </w:pPr>
-      <w:r>
-        <w:t xml:space="preserve">FF-004 — Navigating large software projects is difficult. </w:t>
-      </w:r>
-    </w:p>
-    <w:p>
-      <w:r>
-        <w:pict w14:anchorId="18A46F37">
-          <v:rect id="_x0000_i1089" style="width:0;height:1.5pt" o:hralign="center" o:hrstd="t" o:hr="t" fillcolor="#a0a0a0" stroked="f"/>
-        </w:pict>
-      </w:r>
-    </w:p>
-    <w:p>
-      <w:pPr>
-        <w:rPr>
-          <w:b/>
-          <w:bCs/>
-        </w:rPr>
-      </w:pPr>
-      <w:r>
-        <w:rPr>
-          <w:b/>
-          <w:bCs/>
-        </w:rPr>
-        <w:t>Why this Pattern Occurs</w:t>
-      </w:r>
-    </w:p>
-    <w:p>
-      <w:r>
-        <w:t>Common contributing factors include:</w:t>
-      </w:r>
-    </w:p>
-    <w:p>
-      <w:pPr>
-        <w:numPr>
-          <w:ilvl w:val="0"/>
-          <w:numId w:val="2"/>
-        </w:numPr>
-      </w:pPr>
-      <w:r>
-        <w:t xml:space="preserve">Human memory decays over time. </w:t>
-      </w:r>
-    </w:p>
-    <w:p>
-      <w:pPr>
-        <w:numPr>
-          <w:ilvl w:val="0"/>
-          <w:numId w:val="2"/>
-        </w:numPr>
-      </w:pPr>
-      <w:r>
-        <w:t xml:space="preserve">Context is rarely preserved alongside information. </w:t>
-      </w:r>
-    </w:p>
-    <w:p>
-      <w:pPr>
-        <w:numPr>
-          <w:ilvl w:val="0"/>
-          <w:numId w:val="2"/>
-        </w:numPr>
-      </w:pPr>
-      <w:r>
-        <w:t xml:space="preserve">Systems emphasize storage over understanding. </w:t>
-      </w:r>
-    </w:p>
-    <w:p>
-      <w:pPr>
-        <w:numPr>
-          <w:ilvl w:val="0"/>
-          <w:numId w:val="2"/>
-        </w:numPr>
-      </w:pPr>
-      <w:r>
-        <w:t xml:space="preserve">Digital content grows continuously. </w:t>
-      </w:r>
-    </w:p>
-    <w:p>
-      <w:pPr>
-        <w:numPr>
-          <w:ilvl w:val="0"/>
-          <w:numId w:val="2"/>
-        </w:numPr>
-      </w:pPr>
-      <w:r>
-        <w:t xml:space="preserve">Relationships between information become hidden. </w:t>
-      </w:r>
-    </w:p>
-    <w:p>
-      <w:r>
-        <w:pict w14:anchorId="774B4474">
-          <v:rect id="_x0000_i1090" style="width:0;height:1.5pt" o:hralign="center" o:hrstd="t" o:hr="t" fillcolor="#a0a0a0" stroked="f"/>
-        </w:pict>
-      </w:r>
-    </w:p>
-    <w:p>
-      <w:pPr>
-        <w:rPr>
-          <w:b/>
-          <w:bCs/>
-        </w:rPr>
-      </w:pPr>
-      <w:r>
-        <w:rPr>
-          <w:b/>
-          <w:bCs/>
-        </w:rPr>
-        <w:t>Human Impact</w:t>
-      </w:r>
-    </w:p>
-    <w:p>
-      <w:r>
-        <w:t>This pattern contributes to:</w:t>
-      </w:r>
-    </w:p>
-    <w:p>
-      <w:pPr>
-        <w:numPr>
-          <w:ilvl w:val="0"/>
-          <w:numId w:val="3"/>
-        </w:numPr>
-      </w:pPr>
-      <w:r>
-        <w:t xml:space="preserve">Increased cognitive load. </w:t>
-      </w:r>
-    </w:p>
-    <w:p>
-      <w:pPr>
-        <w:numPr>
-          <w:ilvl w:val="0"/>
-          <w:numId w:val="3"/>
-        </w:numPr>
-      </w:pPr>
-      <w:r>
-        <w:t xml:space="preserve">Longer search times. </w:t>
-      </w:r>
-    </w:p>
-    <w:p>
-      <w:pPr>
-        <w:numPr>
-          <w:ilvl w:val="0"/>
-          <w:numId w:val="3"/>
-        </w:numPr>
-      </w:pPr>
-      <w:r>
-        <w:t xml:space="preserve">Duplicate work. </w:t>
-      </w:r>
-    </w:p>
-    <w:p>
-      <w:pPr>
-        <w:numPr>
-          <w:ilvl w:val="0"/>
-          <w:numId w:val="3"/>
-        </w:numPr>
-      </w:pPr>
-      <w:r>
-        <w:t xml:space="preserve">Reduced confidence. </w:t>
-      </w:r>
-    </w:p>
-    <w:p>
-      <w:pPr>
-        <w:numPr>
-          <w:ilvl w:val="0"/>
-          <w:numId w:val="3"/>
-        </w:numPr>
-      </w:pPr>
-      <w:r>
-        <w:t xml:space="preserve">Lower productivity. </w:t>
-      </w:r>
-    </w:p>
-    <w:p>
-      <w:pPr>
-        <w:numPr>
-          <w:ilvl w:val="0"/>
-          <w:numId w:val="3"/>
-        </w:numPr>
-      </w:pPr>
-      <w:r>
-        <w:t xml:space="preserve">Interrupted workflows. </w:t>
-      </w:r>
-    </w:p>
-    <w:p>
-      <w:r>
-        <w:pict w14:anchorId="1D8E0E2E">
-          <v:rect id="_x0000_i1091" style="width:0;height:1.5pt" o:hralign="center" o:hrstd="t" o:hr="t" fillcolor="#a0a0a0" stroked="f"/>
-        </w:pict>
-      </w:r>
-    </w:p>
-    <w:p>
-      <w:pPr>
-        <w:rPr>
-          <w:b/>
-          <w:bCs/>
-        </w:rPr>
-      </w:pPr>
-      <w:r>
-        <w:rPr>
-          <w:b/>
-          <w:bCs/>
-        </w:rPr>
-        <w:t>Possible UIL Research Directions</w:t>
-      </w:r>
-    </w:p>
-    <w:p>
-      <w:r>
-        <w:t>Potential approaches include:</w:t>
-      </w:r>
-    </w:p>
-    <w:p>
-      <w:pPr>
-        <w:numPr>
-          <w:ilvl w:val="0"/>
-          <w:numId w:val="4"/>
-        </w:numPr>
-      </w:pPr>
-      <w:r>
-        <w:t xml:space="preserve">Context-aware information systems. </w:t>
-      </w:r>
-    </w:p>
-    <w:p>
-      <w:pPr>
-        <w:numPr>
-          <w:ilvl w:val="0"/>
-          <w:numId w:val="4"/>
-        </w:numPr>
-      </w:pPr>
-      <w:r>
-        <w:t xml:space="preserve">Semantic memory for digital assets. </w:t>
-      </w:r>
-    </w:p>
-    <w:p>
-      <w:pPr>
-        <w:numPr>
-          <w:ilvl w:val="0"/>
-          <w:numId w:val="4"/>
-        </w:numPr>
-      </w:pPr>
-      <w:r>
-        <w:lastRenderedPageBreak/>
-        <w:t xml:space="preserve">AI-generated contextual summaries. </w:t>
-      </w:r>
-    </w:p>
-    <w:p>
-      <w:pPr>
-        <w:numPr>
-          <w:ilvl w:val="0"/>
-          <w:numId w:val="4"/>
-        </w:numPr>
-      </w:pPr>
-      <w:r>
-        <w:t xml:space="preserve">Intent-based navigation. </w:t>
-      </w:r>
-    </w:p>
-    <w:p>
-      <w:pPr>
-        <w:numPr>
-          <w:ilvl w:val="0"/>
-          <w:numId w:val="4"/>
-        </w:numPr>
-      </w:pPr>
-      <w:r>
-        <w:t xml:space="preserve">Relationship-aware knowledge organization. </w:t>
-      </w:r>
-    </w:p>
-    <w:p>
-      <w:r>
-        <w:pict w14:anchorId="6DC2ADE2">
-          <v:rect id="_x0000_i1092" style="width:0;height:1.5pt" o:hralign="center" o:hrstd="t" o:hr="t" fillcolor="#a0a0a0" stroked="f"/>
-        </w:pict>
-      </w:r>
-    </w:p>
-    <w:p>
-      <w:pPr>
-        <w:rPr>
-          <w:b/>
-          <w:bCs/>
-        </w:rPr>
-      </w:pPr>
-      <w:r>
-        <w:rPr>
-          <w:b/>
-          <w:bCs/>
-        </w:rPr>
-        <w:t>Related Human Frictions</w:t>
-      </w:r>
-    </w:p>
-    <w:p>
-      <w:pPr>
-        <w:numPr>
-          <w:ilvl w:val="0"/>
-          <w:numId w:val="5"/>
-        </w:numPr>
-      </w:pPr>
-      <w:r>
-        <w:t xml:space="preserve">FF-001 </w:t>
-      </w:r>
-    </w:p>
-    <w:p>
-      <w:pPr>
-        <w:numPr>
-          <w:ilvl w:val="0"/>
-          <w:numId w:val="5"/>
-        </w:numPr>
-      </w:pPr>
-      <w:r>
-        <w:t xml:space="preserve">FF-002 </w:t>
-      </w:r>
-    </w:p>
-    <w:p>
-      <w:pPr>
-        <w:numPr>
-          <w:ilvl w:val="0"/>
-          <w:numId w:val="5"/>
-        </w:numPr>
-      </w:pPr>
-      <w:r>
-        <w:t xml:space="preserve">FF-003 </w:t>
-      </w:r>
-    </w:p>
-    <w:p>
-      <w:pPr>
-        <w:numPr>
-          <w:ilvl w:val="0"/>
-          <w:numId w:val="5"/>
-        </w:numPr>
-      </w:pPr>
-      <w:r>
-        <w:t xml:space="preserve">FF-004 </w:t>
-      </w:r>
-    </w:p>
-    <w:p>
-      <w:r>
-        <w:pict w14:anchorId="6095B9A0">
-          <v:rect id="_x0000_i1093" style="width:0;height:1.5pt" o:hralign="center" o:hrstd="t" o:hr="t" fillcolor="#a0a0a0" stroked="f"/>
-        </w:pict>
-      </w:r>
-    </w:p>
-    <w:p>
-      <w:pPr>
-        <w:rPr>
-          <w:b/>
-          <w:bCs/>
-        </w:rPr>
-      </w:pPr>
-      <w:r>
-        <w:rPr>
-          <w:b/>
-          <w:bCs/>
-        </w:rPr>
-        <w:t>Related Research Insights</w:t>
-      </w:r>
-    </w:p>
-    <w:p>
-      <w:r>
-        <w:rPr>
-          <w:i/>
-          <w:iCs/>
-        </w:rPr>
-        <w:t>None yet.</w:t>
-      </w:r>
-    </w:p>
-    <w:p>
-      <w:r>
-        <w:pict w14:anchorId="6AFF1925">
-          <v:rect id="_x0000_i1094" style="width:0;height:1.5pt" o:hralign="center" o:hrstd="t" o:hr="t" fillcolor="#a0a0a0" stroked="f"/>
-        </w:pict>
-      </w:r>
-    </w:p>
-    <w:p>
-      <w:pPr>
-        <w:rPr>
-          <w:b/>
-          <w:bCs/>
-        </w:rPr>
-      </w:pPr>
-      <w:r>
-        <w:rPr>
-          <w:b/>
-          <w:bCs/>
-        </w:rPr>
-        <w:t>Notes</w:t>
-      </w:r>
-    </w:p>
-    <w:p>
-      <w:r>
-        <w:t xml:space="preserve">This pattern should continue to be validated as additional Human Frictions are documented. If future categories also exhibit the same </w:t>
-      </w:r>
-      <w:proofErr w:type="spellStart"/>
-      <w:r>
-        <w:t>behavior</w:t>
-      </w:r>
-      <w:proofErr w:type="spellEnd"/>
-      <w:r>
-        <w:t>, the confidence level and evidence base should be expanded.</w:t>
-      </w:r>
-    </w:p>
     <w:p/>
     <w:sectPr>
       <w:pgSz w:w="11906" w:h="16838"/>
@@ -1376,6 +1275,155 @@
     </w:lvl>
   </w:abstractNum>
   <w:abstractNum w:abstractNumId="3" w15:restartNumberingAfterBreak="0">
+    <w:nsid w:val="1A5A2581"/>
+    <w:multiLevelType w:val="multilevel"/>
+    <w:tmpl w:val="DFB26D6A"/>
+    <w:lvl w:ilvl="0">
+      <w:start w:val="1"/>
+      <w:numFmt w:val="bullet"/>
+      <w:lvlText w:val=""/>
+      <w:lvlJc w:val="left"/>
+      <w:pPr>
+        <w:tabs>
+          <w:tab w:val="num" w:pos="720"/>
+        </w:tabs>
+        <w:ind w:left="720" w:hanging="360"/>
+      </w:pPr>
+      <w:rPr>
+        <w:rFonts w:ascii="Symbol" w:hAnsi="Symbol" w:hint="default"/>
+        <w:sz w:val="20"/>
+      </w:rPr>
+    </w:lvl>
+    <w:lvl w:ilvl="1" w:tentative="1">
+      <w:start w:val="1"/>
+      <w:numFmt w:val="bullet"/>
+      <w:lvlText w:val="o"/>
+      <w:lvlJc w:val="left"/>
+      <w:pPr>
+        <w:tabs>
+          <w:tab w:val="num" w:pos="1440"/>
+        </w:tabs>
+        <w:ind w:left="1440" w:hanging="360"/>
+      </w:pPr>
+      <w:rPr>
+        <w:rFonts w:ascii="Courier New" w:hAnsi="Courier New" w:hint="default"/>
+        <w:sz w:val="20"/>
+      </w:rPr>
+    </w:lvl>
+    <w:lvl w:ilvl="2" w:tentative="1">
+      <w:start w:val="1"/>
+      <w:numFmt w:val="bullet"/>
+      <w:lvlText w:val=""/>
+      <w:lvlJc w:val="left"/>
+      <w:pPr>
+        <w:tabs>
+          <w:tab w:val="num" w:pos="2160"/>
+        </w:tabs>
+        <w:ind w:left="2160" w:hanging="360"/>
+      </w:pPr>
+      <w:rPr>
+        <w:rFonts w:ascii="Wingdings" w:hAnsi="Wingdings" w:hint="default"/>
+        <w:sz w:val="20"/>
+      </w:rPr>
+    </w:lvl>
+    <w:lvl w:ilvl="3" w:tentative="1">
+      <w:start w:val="1"/>
+      <w:numFmt w:val="bullet"/>
+      <w:lvlText w:val=""/>
+      <w:lvlJc w:val="left"/>
+      <w:pPr>
+        <w:tabs>
+          <w:tab w:val="num" w:pos="2880"/>
+        </w:tabs>
+        <w:ind w:left="2880" w:hanging="360"/>
+      </w:pPr>
+      <w:rPr>
+        <w:rFonts w:ascii="Wingdings" w:hAnsi="Wingdings" w:hint="default"/>
+        <w:sz w:val="20"/>
+      </w:rPr>
+    </w:lvl>
+    <w:lvl w:ilvl="4" w:tentative="1">
+      <w:start w:val="1"/>
+      <w:numFmt w:val="bullet"/>
+      <w:lvlText w:val=""/>
+      <w:lvlJc w:val="left"/>
+      <w:pPr>
+        <w:tabs>
+          <w:tab w:val="num" w:pos="3600"/>
+        </w:tabs>
+        <w:ind w:left="3600" w:hanging="360"/>
+      </w:pPr>
+      <w:rPr>
+        <w:rFonts w:ascii="Wingdings" w:hAnsi="Wingdings" w:hint="default"/>
+        <w:sz w:val="20"/>
+      </w:rPr>
+    </w:lvl>
+    <w:lvl w:ilvl="5" w:tentative="1">
+      <w:start w:val="1"/>
+      <w:numFmt w:val="bullet"/>
+      <w:lvlText w:val=""/>
+      <w:lvlJc w:val="left"/>
+      <w:pPr>
+        <w:tabs>
+          <w:tab w:val="num" w:pos="4320"/>
+        </w:tabs>
+        <w:ind w:left="4320" w:hanging="360"/>
+      </w:pPr>
+      <w:rPr>
+        <w:rFonts w:ascii="Wingdings" w:hAnsi="Wingdings" w:hint="default"/>
+        <w:sz w:val="20"/>
+      </w:rPr>
+    </w:lvl>
+    <w:lvl w:ilvl="6" w:tentative="1">
+      <w:start w:val="1"/>
+      <w:numFmt w:val="bullet"/>
+      <w:lvlText w:val=""/>
+      <w:lvlJc w:val="left"/>
+      <w:pPr>
+        <w:tabs>
+          <w:tab w:val="num" w:pos="5040"/>
+        </w:tabs>
+        <w:ind w:left="5040" w:hanging="360"/>
+      </w:pPr>
+      <w:rPr>
+        <w:rFonts w:ascii="Wingdings" w:hAnsi="Wingdings" w:hint="default"/>
+        <w:sz w:val="20"/>
+      </w:rPr>
+    </w:lvl>
+    <w:lvl w:ilvl="7" w:tentative="1">
+      <w:start w:val="1"/>
+      <w:numFmt w:val="bullet"/>
+      <w:lvlText w:val=""/>
+      <w:lvlJc w:val="left"/>
+      <w:pPr>
+        <w:tabs>
+          <w:tab w:val="num" w:pos="5760"/>
+        </w:tabs>
+        <w:ind w:left="5760" w:hanging="360"/>
+      </w:pPr>
+      <w:rPr>
+        <w:rFonts w:ascii="Wingdings" w:hAnsi="Wingdings" w:hint="default"/>
+        <w:sz w:val="20"/>
+      </w:rPr>
+    </w:lvl>
+    <w:lvl w:ilvl="8" w:tentative="1">
+      <w:start w:val="1"/>
+      <w:numFmt w:val="bullet"/>
+      <w:lvlText w:val=""/>
+      <w:lvlJc w:val="left"/>
+      <w:pPr>
+        <w:tabs>
+          <w:tab w:val="num" w:pos="6480"/>
+        </w:tabs>
+        <w:ind w:left="6480" w:hanging="360"/>
+      </w:pPr>
+      <w:rPr>
+        <w:rFonts w:ascii="Wingdings" w:hAnsi="Wingdings" w:hint="default"/>
+        <w:sz w:val="20"/>
+      </w:rPr>
+    </w:lvl>
+  </w:abstractNum>
+  <w:abstractNum w:abstractNumId="4" w15:restartNumberingAfterBreak="0">
     <w:nsid w:val="1D905887"/>
     <w:multiLevelType w:val="multilevel"/>
     <w:tmpl w:val="DD78DE54"/>
@@ -1524,7 +1572,7 @@
       </w:rPr>
     </w:lvl>
   </w:abstractNum>
-  <w:abstractNum w:abstractNumId="4" w15:restartNumberingAfterBreak="0">
+  <w:abstractNum w:abstractNumId="5" w15:restartNumberingAfterBreak="0">
     <w:nsid w:val="4F496D7F"/>
     <w:multiLevelType w:val="multilevel"/>
     <w:tmpl w:val="F2740756"/>
@@ -1673,8 +1721,306 @@
       </w:rPr>
     </w:lvl>
   </w:abstractNum>
+  <w:abstractNum w:abstractNumId="6" w15:restartNumberingAfterBreak="0">
+    <w:nsid w:val="51D233E5"/>
+    <w:multiLevelType w:val="multilevel"/>
+    <w:tmpl w:val="27684100"/>
+    <w:lvl w:ilvl="0">
+      <w:start w:val="1"/>
+      <w:numFmt w:val="bullet"/>
+      <w:lvlText w:val=""/>
+      <w:lvlJc w:val="left"/>
+      <w:pPr>
+        <w:tabs>
+          <w:tab w:val="num" w:pos="720"/>
+        </w:tabs>
+        <w:ind w:left="720" w:hanging="360"/>
+      </w:pPr>
+      <w:rPr>
+        <w:rFonts w:ascii="Symbol" w:hAnsi="Symbol" w:hint="default"/>
+        <w:sz w:val="20"/>
+      </w:rPr>
+    </w:lvl>
+    <w:lvl w:ilvl="1" w:tentative="1">
+      <w:start w:val="1"/>
+      <w:numFmt w:val="bullet"/>
+      <w:lvlText w:val="o"/>
+      <w:lvlJc w:val="left"/>
+      <w:pPr>
+        <w:tabs>
+          <w:tab w:val="num" w:pos="1440"/>
+        </w:tabs>
+        <w:ind w:left="1440" w:hanging="360"/>
+      </w:pPr>
+      <w:rPr>
+        <w:rFonts w:ascii="Courier New" w:hAnsi="Courier New" w:hint="default"/>
+        <w:sz w:val="20"/>
+      </w:rPr>
+    </w:lvl>
+    <w:lvl w:ilvl="2" w:tentative="1">
+      <w:start w:val="1"/>
+      <w:numFmt w:val="bullet"/>
+      <w:lvlText w:val=""/>
+      <w:lvlJc w:val="left"/>
+      <w:pPr>
+        <w:tabs>
+          <w:tab w:val="num" w:pos="2160"/>
+        </w:tabs>
+        <w:ind w:left="2160" w:hanging="360"/>
+      </w:pPr>
+      <w:rPr>
+        <w:rFonts w:ascii="Wingdings" w:hAnsi="Wingdings" w:hint="default"/>
+        <w:sz w:val="20"/>
+      </w:rPr>
+    </w:lvl>
+    <w:lvl w:ilvl="3" w:tentative="1">
+      <w:start w:val="1"/>
+      <w:numFmt w:val="bullet"/>
+      <w:lvlText w:val=""/>
+      <w:lvlJc w:val="left"/>
+      <w:pPr>
+        <w:tabs>
+          <w:tab w:val="num" w:pos="2880"/>
+        </w:tabs>
+        <w:ind w:left="2880" w:hanging="360"/>
+      </w:pPr>
+      <w:rPr>
+        <w:rFonts w:ascii="Wingdings" w:hAnsi="Wingdings" w:hint="default"/>
+        <w:sz w:val="20"/>
+      </w:rPr>
+    </w:lvl>
+    <w:lvl w:ilvl="4" w:tentative="1">
+      <w:start w:val="1"/>
+      <w:numFmt w:val="bullet"/>
+      <w:lvlText w:val=""/>
+      <w:lvlJc w:val="left"/>
+      <w:pPr>
+        <w:tabs>
+          <w:tab w:val="num" w:pos="3600"/>
+        </w:tabs>
+        <w:ind w:left="3600" w:hanging="360"/>
+      </w:pPr>
+      <w:rPr>
+        <w:rFonts w:ascii="Wingdings" w:hAnsi="Wingdings" w:hint="default"/>
+        <w:sz w:val="20"/>
+      </w:rPr>
+    </w:lvl>
+    <w:lvl w:ilvl="5" w:tentative="1">
+      <w:start w:val="1"/>
+      <w:numFmt w:val="bullet"/>
+      <w:lvlText w:val=""/>
+      <w:lvlJc w:val="left"/>
+      <w:pPr>
+        <w:tabs>
+          <w:tab w:val="num" w:pos="4320"/>
+        </w:tabs>
+        <w:ind w:left="4320" w:hanging="360"/>
+      </w:pPr>
+      <w:rPr>
+        <w:rFonts w:ascii="Wingdings" w:hAnsi="Wingdings" w:hint="default"/>
+        <w:sz w:val="20"/>
+      </w:rPr>
+    </w:lvl>
+    <w:lvl w:ilvl="6" w:tentative="1">
+      <w:start w:val="1"/>
+      <w:numFmt w:val="bullet"/>
+      <w:lvlText w:val=""/>
+      <w:lvlJc w:val="left"/>
+      <w:pPr>
+        <w:tabs>
+          <w:tab w:val="num" w:pos="5040"/>
+        </w:tabs>
+        <w:ind w:left="5040" w:hanging="360"/>
+      </w:pPr>
+      <w:rPr>
+        <w:rFonts w:ascii="Wingdings" w:hAnsi="Wingdings" w:hint="default"/>
+        <w:sz w:val="20"/>
+      </w:rPr>
+    </w:lvl>
+    <w:lvl w:ilvl="7" w:tentative="1">
+      <w:start w:val="1"/>
+      <w:numFmt w:val="bullet"/>
+      <w:lvlText w:val=""/>
+      <w:lvlJc w:val="left"/>
+      <w:pPr>
+        <w:tabs>
+          <w:tab w:val="num" w:pos="5760"/>
+        </w:tabs>
+        <w:ind w:left="5760" w:hanging="360"/>
+      </w:pPr>
+      <w:rPr>
+        <w:rFonts w:ascii="Wingdings" w:hAnsi="Wingdings" w:hint="default"/>
+        <w:sz w:val="20"/>
+      </w:rPr>
+    </w:lvl>
+    <w:lvl w:ilvl="8" w:tentative="1">
+      <w:start w:val="1"/>
+      <w:numFmt w:val="bullet"/>
+      <w:lvlText w:val=""/>
+      <w:lvlJc w:val="left"/>
+      <w:pPr>
+        <w:tabs>
+          <w:tab w:val="num" w:pos="6480"/>
+        </w:tabs>
+        <w:ind w:left="6480" w:hanging="360"/>
+      </w:pPr>
+      <w:rPr>
+        <w:rFonts w:ascii="Wingdings" w:hAnsi="Wingdings" w:hint="default"/>
+        <w:sz w:val="20"/>
+      </w:rPr>
+    </w:lvl>
+  </w:abstractNum>
+  <w:abstractNum w:abstractNumId="7" w15:restartNumberingAfterBreak="0">
+    <w:nsid w:val="6DBD31C1"/>
+    <w:multiLevelType w:val="multilevel"/>
+    <w:tmpl w:val="10ACD7FE"/>
+    <w:lvl w:ilvl="0">
+      <w:start w:val="1"/>
+      <w:numFmt w:val="bullet"/>
+      <w:lvlText w:val=""/>
+      <w:lvlJc w:val="left"/>
+      <w:pPr>
+        <w:tabs>
+          <w:tab w:val="num" w:pos="720"/>
+        </w:tabs>
+        <w:ind w:left="720" w:hanging="360"/>
+      </w:pPr>
+      <w:rPr>
+        <w:rFonts w:ascii="Symbol" w:hAnsi="Symbol" w:hint="default"/>
+        <w:sz w:val="20"/>
+      </w:rPr>
+    </w:lvl>
+    <w:lvl w:ilvl="1" w:tentative="1">
+      <w:start w:val="1"/>
+      <w:numFmt w:val="bullet"/>
+      <w:lvlText w:val="o"/>
+      <w:lvlJc w:val="left"/>
+      <w:pPr>
+        <w:tabs>
+          <w:tab w:val="num" w:pos="1440"/>
+        </w:tabs>
+        <w:ind w:left="1440" w:hanging="360"/>
+      </w:pPr>
+      <w:rPr>
+        <w:rFonts w:ascii="Courier New" w:hAnsi="Courier New" w:hint="default"/>
+        <w:sz w:val="20"/>
+      </w:rPr>
+    </w:lvl>
+    <w:lvl w:ilvl="2" w:tentative="1">
+      <w:start w:val="1"/>
+      <w:numFmt w:val="bullet"/>
+      <w:lvlText w:val=""/>
+      <w:lvlJc w:val="left"/>
+      <w:pPr>
+        <w:tabs>
+          <w:tab w:val="num" w:pos="2160"/>
+        </w:tabs>
+        <w:ind w:left="2160" w:hanging="360"/>
+      </w:pPr>
+      <w:rPr>
+        <w:rFonts w:ascii="Wingdings" w:hAnsi="Wingdings" w:hint="default"/>
+        <w:sz w:val="20"/>
+      </w:rPr>
+    </w:lvl>
+    <w:lvl w:ilvl="3" w:tentative="1">
+      <w:start w:val="1"/>
+      <w:numFmt w:val="bullet"/>
+      <w:lvlText w:val=""/>
+      <w:lvlJc w:val="left"/>
+      <w:pPr>
+        <w:tabs>
+          <w:tab w:val="num" w:pos="2880"/>
+        </w:tabs>
+        <w:ind w:left="2880" w:hanging="360"/>
+      </w:pPr>
+      <w:rPr>
+        <w:rFonts w:ascii="Wingdings" w:hAnsi="Wingdings" w:hint="default"/>
+        <w:sz w:val="20"/>
+      </w:rPr>
+    </w:lvl>
+    <w:lvl w:ilvl="4" w:tentative="1">
+      <w:start w:val="1"/>
+      <w:numFmt w:val="bullet"/>
+      <w:lvlText w:val=""/>
+      <w:lvlJc w:val="left"/>
+      <w:pPr>
+        <w:tabs>
+          <w:tab w:val="num" w:pos="3600"/>
+        </w:tabs>
+        <w:ind w:left="3600" w:hanging="360"/>
+      </w:pPr>
+      <w:rPr>
+        <w:rFonts w:ascii="Wingdings" w:hAnsi="Wingdings" w:hint="default"/>
+        <w:sz w:val="20"/>
+      </w:rPr>
+    </w:lvl>
+    <w:lvl w:ilvl="5" w:tentative="1">
+      <w:start w:val="1"/>
+      <w:numFmt w:val="bullet"/>
+      <w:lvlText w:val=""/>
+      <w:lvlJc w:val="left"/>
+      <w:pPr>
+        <w:tabs>
+          <w:tab w:val="num" w:pos="4320"/>
+        </w:tabs>
+        <w:ind w:left="4320" w:hanging="360"/>
+      </w:pPr>
+      <w:rPr>
+        <w:rFonts w:ascii="Wingdings" w:hAnsi="Wingdings" w:hint="default"/>
+        <w:sz w:val="20"/>
+      </w:rPr>
+    </w:lvl>
+    <w:lvl w:ilvl="6" w:tentative="1">
+      <w:start w:val="1"/>
+      <w:numFmt w:val="bullet"/>
+      <w:lvlText w:val=""/>
+      <w:lvlJc w:val="left"/>
+      <w:pPr>
+        <w:tabs>
+          <w:tab w:val="num" w:pos="5040"/>
+        </w:tabs>
+        <w:ind w:left="5040" w:hanging="360"/>
+      </w:pPr>
+      <w:rPr>
+        <w:rFonts w:ascii="Wingdings" w:hAnsi="Wingdings" w:hint="default"/>
+        <w:sz w:val="20"/>
+      </w:rPr>
+    </w:lvl>
+    <w:lvl w:ilvl="7" w:tentative="1">
+      <w:start w:val="1"/>
+      <w:numFmt w:val="bullet"/>
+      <w:lvlText w:val=""/>
+      <w:lvlJc w:val="left"/>
+      <w:pPr>
+        <w:tabs>
+          <w:tab w:val="num" w:pos="5760"/>
+        </w:tabs>
+        <w:ind w:left="5760" w:hanging="360"/>
+      </w:pPr>
+      <w:rPr>
+        <w:rFonts w:ascii="Wingdings" w:hAnsi="Wingdings" w:hint="default"/>
+        <w:sz w:val="20"/>
+      </w:rPr>
+    </w:lvl>
+    <w:lvl w:ilvl="8" w:tentative="1">
+      <w:start w:val="1"/>
+      <w:numFmt w:val="bullet"/>
+      <w:lvlText w:val=""/>
+      <w:lvlJc w:val="left"/>
+      <w:pPr>
+        <w:tabs>
+          <w:tab w:val="num" w:pos="6480"/>
+        </w:tabs>
+        <w:ind w:left="6480" w:hanging="360"/>
+      </w:pPr>
+      <w:rPr>
+        <w:rFonts w:ascii="Wingdings" w:hAnsi="Wingdings" w:hint="default"/>
+        <w:sz w:val="20"/>
+      </w:rPr>
+    </w:lvl>
+  </w:abstractNum>
   <w:num w:numId="1" w16cid:durableId="1978022575">
-    <w:abstractNumId w:val="3"/>
+    <w:abstractNumId w:val="4"/>
   </w:num>
   <w:num w:numId="2" w16cid:durableId="1269123150">
     <w:abstractNumId w:val="2"/>
@@ -1683,10 +2029,19 @@
     <w:abstractNumId w:val="1"/>
   </w:num>
   <w:num w:numId="4" w16cid:durableId="1437140261">
-    <w:abstractNumId w:val="4"/>
+    <w:abstractNumId w:val="5"/>
   </w:num>
   <w:num w:numId="5" w16cid:durableId="1606419951">
     <w:abstractNumId w:val="0"/>
+  </w:num>
+  <w:num w:numId="6" w16cid:durableId="1758166820">
+    <w:abstractNumId w:val="7"/>
+  </w:num>
+  <w:num w:numId="7" w16cid:durableId="298728288">
+    <w:abstractNumId w:val="6"/>
+  </w:num>
+  <w:num w:numId="8" w16cid:durableId="1783525048">
+    <w:abstractNumId w:val="3"/>
   </w:num>
 </w:numbering>
 </file>

</xml_diff>